<commit_message>
update slides and reflection log templete
</commit_message>
<xml_diff>
--- a/A1_introduction/Reflection-Log-Block1.docx
+++ b/A1_introduction/Reflection-Log-Block1.docx
@@ -115,64 +115,8 @@
                 <w:szCs w:val="18"/>
                 <w:lang w:val="en-US"/>
               </w:rPr>
-              <w:t>Name</w:t>
+              <w:t xml:space="preserve">Full </w:t>
             </w:r>
-          </w:p>
-        </w:tc>
-        <w:tc>
-          <w:tcPr>
-            <w:tcW w:w="7706" w:type="dxa"/>
-            <w:tcBorders>
-              <w:top w:val="single" w:sz="1" w:space="0" w:color="CCCCCC"/>
-              <w:left w:val="single" w:sz="1" w:space="0" w:color="CCCCCC"/>
-              <w:bottom w:val="single" w:sz="1" w:space="0" w:color="CCCCCC"/>
-              <w:right w:val="single" w:sz="1" w:space="0" w:color="CCCCCC"/>
-            </w:tcBorders>
-            <w:shd w:val="clear" w:color="auto" w:fill="FFFFFF"/>
-            <w:tcMar>
-              <w:top w:w="60" w:type="dxa"/>
-              <w:left w:w="120" w:type="dxa"/>
-              <w:bottom w:w="60" w:type="dxa"/>
-              <w:right w:w="120" w:type="dxa"/>
-            </w:tcMar>
-          </w:tcPr>
-          <w:p>
-            <w:pPr>
-              <w:rPr>
-                <w:lang w:val="en-US"/>
-              </w:rPr>
-            </w:pPr>
-          </w:p>
-        </w:tc>
-      </w:tr>
-      <w:tr>
-        <w:trPr>
-          <w:trHeight w:val="400"/>
-        </w:trPr>
-        <w:tc>
-          <w:tcPr>
-            <w:tcW w:w="1800" w:type="dxa"/>
-            <w:tcBorders>
-              <w:top w:val="single" w:sz="1" w:space="0" w:color="CCCCCC"/>
-              <w:left w:val="single" w:sz="1" w:space="0" w:color="CCCCCC"/>
-              <w:bottom w:val="single" w:sz="1" w:space="0" w:color="CCCCCC"/>
-              <w:right w:val="single" w:sz="1" w:space="0" w:color="CCCCCC"/>
-            </w:tcBorders>
-            <w:shd w:val="clear" w:color="auto" w:fill="F5F5F5"/>
-            <w:tcMar>
-              <w:top w:w="60" w:type="dxa"/>
-              <w:left w:w="120" w:type="dxa"/>
-              <w:bottom w:w="60" w:type="dxa"/>
-              <w:right w:w="120" w:type="dxa"/>
-            </w:tcMar>
-            <w:vAlign w:val="center"/>
-          </w:tcPr>
-          <w:p>
-            <w:pPr>
-              <w:rPr>
-                <w:lang w:val="en-US"/>
-              </w:rPr>
-            </w:pPr>
             <w:r>
               <w:rPr>
                 <w:b/>
@@ -238,12 +182,69 @@
               <w:rPr>
                 <w:b/>
                 <w:bCs/>
-                <w:sz w:val="18"/>
-                <w:szCs w:val="18"/>
                 <w:lang w:val="en-US"/>
               </w:rPr>
             </w:pPr>
             <w:r>
+              <w:rPr>
+                <w:b/>
+                <w:bCs/>
+                <w:lang w:val="en-US"/>
+              </w:rPr>
+              <w:t>Institution</w:t>
+            </w:r>
+          </w:p>
+        </w:tc>
+        <w:tc>
+          <w:tcPr>
+            <w:tcW w:w="7706" w:type="dxa"/>
+            <w:tcBorders>
+              <w:top w:val="single" w:sz="1" w:space="0" w:color="CCCCCC"/>
+              <w:left w:val="single" w:sz="1" w:space="0" w:color="CCCCCC"/>
+              <w:bottom w:val="single" w:sz="1" w:space="0" w:color="CCCCCC"/>
+              <w:right w:val="single" w:sz="1" w:space="0" w:color="CCCCCC"/>
+            </w:tcBorders>
+            <w:shd w:val="clear" w:color="auto" w:fill="FFFFFF"/>
+            <w:tcMar>
+              <w:top w:w="60" w:type="dxa"/>
+              <w:left w:w="120" w:type="dxa"/>
+              <w:bottom w:w="60" w:type="dxa"/>
+              <w:right w:w="120" w:type="dxa"/>
+            </w:tcMar>
+          </w:tcPr>
+          <w:p>
+            <w:pPr>
+              <w:rPr>
+                <w:lang w:val="en-US"/>
+              </w:rPr>
+            </w:pPr>
+          </w:p>
+        </w:tc>
+      </w:tr>
+      <w:tr>
+        <w:trPr>
+          <w:trHeight w:val="400"/>
+        </w:trPr>
+        <w:tc>
+          <w:tcPr>
+            <w:tcW w:w="1800" w:type="dxa"/>
+            <w:tcBorders>
+              <w:top w:val="single" w:sz="1" w:space="0" w:color="CCCCCC"/>
+              <w:left w:val="single" w:sz="1" w:space="0" w:color="CCCCCC"/>
+              <w:bottom w:val="single" w:sz="1" w:space="0" w:color="CCCCCC"/>
+              <w:right w:val="single" w:sz="1" w:space="0" w:color="CCCCCC"/>
+            </w:tcBorders>
+            <w:shd w:val="clear" w:color="auto" w:fill="F5F5F5"/>
+            <w:tcMar>
+              <w:top w:w="60" w:type="dxa"/>
+              <w:left w:w="120" w:type="dxa"/>
+              <w:bottom w:w="60" w:type="dxa"/>
+              <w:right w:w="120" w:type="dxa"/>
+            </w:tcMar>
+            <w:vAlign w:val="center"/>
+          </w:tcPr>
+          <w:p>
+            <w:pPr>
               <w:rPr>
                 <w:b/>
                 <w:bCs/>
@@ -251,7 +252,16 @@
                 <w:szCs w:val="18"/>
                 <w:lang w:val="en-US"/>
               </w:rPr>
-              <w:t>Name</w:t>
+            </w:pPr>
+            <w:r>
+              <w:rPr>
+                <w:b/>
+                <w:bCs/>
+                <w:sz w:val="18"/>
+                <w:szCs w:val="18"/>
+                <w:lang w:val="en-US"/>
+              </w:rPr>
+              <w:t>E-Mail</w:t>
             </w:r>
           </w:p>
         </w:tc>

</xml_diff>